<commit_message>
docs: tighten final L2 action language
</commit_message>
<xml_diff>
--- a/docs/proposals/utc-health-category/health-coverage-maintenance-l2-final.docx
+++ b/docs/proposals/utc-health-category/health-coverage-maintenance-l2-final.docx
@@ -8,6 +8,53 @@
       </w:pPr>
       <w:r>
         <w:t xml:space="preserve">Health-Related Emoji Coverage as a Standards-Maintenance Issue</w:t>
+      </w:r>
+    </w:p>
+    <w:p>
+      <w:pPr>
+        <w:pStyle w:val="SourceCode"/>
+      </w:pPr>
+      <w:r>
+        <w:rPr>
+          <w:rStyle w:val="VerbatimChar"/>
+        </w:rPr>
+        <w:t xml:space="preserve">Title:  Health-Related Emoji Coverage as a Standards-Maintenance Issue</w:t>
+      </w:r>
+      <w:r>
+        <w:br/>
+      </w:r>
+      <w:r>
+        <w:rPr>
+          <w:rStyle w:val="VerbatimChar"/>
+        </w:rPr>
+        <w:t xml:space="preserve">Source: David Rhew, Microsoft; Shuhan He</w:t>
+      </w:r>
+      <w:r>
+        <w:br/>
+      </w:r>
+      <w:r>
+        <w:rPr>
+          <w:rStyle w:val="VerbatimChar"/>
+        </w:rPr>
+        <w:t xml:space="preserve">Date:   2026-07-10</w:t>
+      </w:r>
+      <w:r>
+        <w:br/>
+      </w:r>
+      <w:r>
+        <w:rPr>
+          <w:rStyle w:val="VerbatimChar"/>
+        </w:rPr>
+        <w:t xml:space="preserve">Status: Individual Contribution</w:t>
+      </w:r>
+      <w:r>
+        <w:br/>
+      </w:r>
+      <w:r>
+        <w:rPr>
+          <w:rStyle w:val="VerbatimChar"/>
+        </w:rPr>
+        <w:t xml:space="preserve">Action: For consideration by UTC; refer to ESR</w:t>
       </w:r>
     </w:p>
     <w:p>
@@ -25,7 +72,7 @@
         <w:t xml:space="preserve"> </w:t>
       </w:r>
       <w:r>
-        <w:t xml:space="preserve">Final discussion draft for Microsoft review and referral to the Unicode Technical Committee (UTC) and the Emoji Standard and Research Working Group (ESR).</w:t>
+        <w:t xml:space="preserve">Final discussion document for Microsoft review and referral to the Unicode Technical Committee (UTC) and the Emoji Standard and Research Working Group (ESR).</w:t>
       </w:r>
     </w:p>
     <w:bookmarkStart w:id="9" w:name="executive-summary"/>
@@ -50,7 +97,7 @@
         <w:pStyle w:val="BodyText"/>
       </w:pPr>
       <w:r>
-        <w:t xml:space="preserve">This document asks the UTC and ESR to recognize the maintenance issue, review the organization of the domain, establish prioritization criteria, route individual concepts through the ordinary Emoji proposal process, and clarify how vendors may provide bounded design, accessibility, rights, evidence, and anticipated-implementation support.</w:t>
+        <w:t xml:space="preserve">This document asks the UTC to authorize ESR to review the maintenance issue and report back on the organization of the domain, prioritization criteria, procedural handling of individual concepts, and bounded vendor support for design, accessibility, rights, evidence, and anticipated implementation.</w:t>
       </w:r>
     </w:p>
     <w:p>
@@ -62,13 +109,13 @@
       </w:r>
     </w:p>
     <w:bookmarkEnd w:id="9"/>
-    <w:bookmarkStart w:id="10" w:name="concrete-request"/>
+    <w:bookmarkStart w:id="10" w:name="why-now"/>
     <w:p>
       <w:pPr>
         <w:pStyle w:val="Heading2"/>
       </w:pPr>
       <w:r>
-        <w:t xml:space="preserve">Concrete request</w:t>
+        <w:t xml:space="preserve">Why now</w:t>
       </w:r>
     </w:p>
     <w:p>
@@ -76,7 +123,25 @@
         <w:pStyle w:val="FirstParagraph"/>
       </w:pPr>
       <w:r>
-        <w:t xml:space="preserve">Microsoft respectfully asks the UTC to refer this document to the ESR for review and recommendation, with the following five questions before it:</w:t>
+        <w:t xml:space="preserve">The 2026 Emoji proposal window is open through July 31, 2026. Several health-related concepts have prior proposal history, and the current project drafts are being rebuilt against the current evidence, image-rights, and submission requirements. A bounded maintenance review would improve process coherence while leaving every individual concept to the normal proposal process.</w:t>
+      </w:r>
+    </w:p>
+    <w:bookmarkEnd w:id="10"/>
+    <w:bookmarkStart w:id="11" w:name="concrete-utc-action-requested"/>
+    <w:p>
+      <w:pPr>
+        <w:pStyle w:val="Heading2"/>
+      </w:pPr>
+      <w:r>
+        <w:t xml:space="preserve">Concrete UTC action requested</w:t>
+      </w:r>
+    </w:p>
+    <w:p>
+      <w:pPr>
+        <w:pStyle w:val="FirstParagraph"/>
+      </w:pPr>
+      <w:r>
+        <w:t xml:space="preserve">Microsoft respectfully asks the UTC to authorize the Emoji Standard and Research Working Group to conduct a bounded review of health-related emoji coverage and report back with recommendations on scope, prioritization criteria, and procedural handling of individual proposals. The review mandate should address the following five questions:</w:t>
       </w:r>
     </w:p>
     <w:p>
@@ -194,11 +259,57 @@
         <w:pStyle w:val="FirstParagraph"/>
       </w:pPr>
       <w:r>
-        <w:t xml:space="preserve">The requested outcome is procedural clarity and serious technical review, not automatic approval.</w:t>
-      </w:r>
-    </w:p>
-    <w:bookmarkEnd w:id="10"/>
-    <w:bookmarkStart w:id="11" w:name="scope-of-the-maintenance-review"/>
+        <w:t xml:space="preserve">The requested outcome is an ESR recommendation and documented review framework, not automatic approval. The UTC need not decide every candidate in the same meeting.</w:t>
+      </w:r>
+    </w:p>
+    <w:bookmarkEnd w:id="11"/>
+    <w:bookmarkStart w:id="12" w:name="two-track-structure"/>
+    <w:p>
+      <w:pPr>
+        <w:pStyle w:val="Heading2"/>
+      </w:pPr>
+      <w:r>
+        <w:t xml:space="preserve">Two-track structure</w:t>
+      </w:r>
+    </w:p>
+    <w:p>
+      <w:pPr>
+        <w:pStyle w:val="FirstParagraph"/>
+      </w:pPr>
+      <w:r>
+        <w:rPr>
+          <w:b/>
+          <w:bCs/>
+        </w:rPr>
+        <w:t xml:space="preserve">Track A - standards maintenance.</w:t>
+      </w:r>
+      <w:r>
+        <w:t xml:space="preserve"> </w:t>
+      </w:r>
+      <w:r>
+        <w:t xml:space="preserve">ESR reviews the organization of existing health-related emoji, the six-domain coverage framework, prioritization criteria, and any process recommendations that should be reported to the UTC.</w:t>
+      </w:r>
+    </w:p>
+    <w:p>
+      <w:pPr>
+        <w:pStyle w:val="BodyText"/>
+      </w:pPr>
+      <w:r>
+        <w:rPr>
+          <w:b/>
+          <w:bCs/>
+        </w:rPr>
+        <w:t xml:space="preserve">Track B - individual proposals.</w:t>
+      </w:r>
+      <w:r>
+        <w:t xml:space="preserve"> </w:t>
+      </w:r>
+      <w:r>
+        <w:t xml:space="preserve">Each candidate is prepared and submitted as a separate, complete Unicode Emoji proposal. Track B does not depend on creation of a new category, and Track A does not pre-approve any candidate.</w:t>
+      </w:r>
+    </w:p>
+    <w:bookmarkEnd w:id="12"/>
+    <w:bookmarkStart w:id="13" w:name="scope-of-the-maintenance-review"/>
     <w:p>
       <w:pPr>
         <w:pStyle w:val="Heading2"/>
@@ -483,8 +594,8 @@
         <w:t xml:space="preserve">The matrix is an analytical tool. It does not imply that every row or gap should produce a character.</w:t>
       </w:r>
     </w:p>
-    <w:bookmarkEnd w:id="11"/>
-    <w:bookmarkStart w:id="12" w:name="prioritization-framework"/>
+    <w:bookmarkEnd w:id="13"/>
+    <w:bookmarkStart w:id="14" w:name="prioritization-framework"/>
     <w:p>
       <w:pPr>
         <w:pStyle w:val="Heading2"/>
@@ -729,8 +840,8 @@
         <w:t xml:space="preserve">No single factor decides a candidate. A high-profile medical endorsement cannot substitute for public frequency evidence, and a high search count cannot cure an indistinct or overly specific design.</w:t>
       </w:r>
     </w:p>
-    <w:bookmarkEnd w:id="12"/>
-    <w:bookmarkStart w:id="13" w:name="relationship-to-individual-submissions"/>
+    <w:bookmarkEnd w:id="14"/>
+    <w:bookmarkStart w:id="15" w:name="relationship-to-individual-submissions"/>
     <w:p>
       <w:pPr>
         <w:pStyle w:val="Heading2"/>
@@ -763,8 +874,8 @@
         <w:t xml:space="preserve">The current project drafts and evidence work are inputs, not substitutes for the final packet. Every TODO, placeholder, pending screenshot, unresolved rights statement, and unverified eligibility date is a release blocker.</w:t>
       </w:r>
     </w:p>
-    <w:bookmarkEnd w:id="13"/>
-    <w:bookmarkStart w:id="14" w:name="vendor-participation-model"/>
+    <w:bookmarkEnd w:id="15"/>
+    <w:bookmarkStart w:id="16" w:name="vendor-participation-model"/>
     <w:p>
       <w:pPr>
         <w:pStyle w:val="Heading2"/>
@@ -778,7 +889,7 @@
         <w:pStyle w:val="FirstParagraph"/>
       </w:pPr>
       <w:r>
-        <w:t xml:space="preserve">Vendor participation should be transparent and bounded:</w:t>
+        <w:t xml:space="preserve">Vendor participation should be optional, transparent, non-binding, and non-exclusive. It should be bounded to:</w:t>
       </w:r>
     </w:p>
     <w:p>
@@ -858,11 +969,11 @@
         <w:pStyle w:val="FirstParagraph"/>
       </w:pPr>
       <w:r>
-        <w:t xml:space="preserve">Vendor review is not a vote, a frequency statistic, a request for exact artwork, or a commitment to ship an encoded character.</w:t>
-      </w:r>
-    </w:p>
-    <w:bookmarkEnd w:id="14"/>
-    <w:bookmarkStart w:id="15" w:name="X94c7374cb5b3db78b6a3f52097435d9f82291e7"/>
+        <w:t xml:space="preserve">Vendor review is not a vote, a frequency statistic, a substitute for Unicode evidence, a request for exact artwork, an exclusive endorsement, or a commitment to ship an encoded character.</w:t>
+      </w:r>
+    </w:p>
+    <w:bookmarkEnd w:id="16"/>
+    <w:bookmarkStart w:id="17" w:name="X94c7374cb5b3db78b6a3f52097435d9f82291e7"/>
     <w:p>
       <w:pPr>
         <w:pStyle w:val="Heading2"/>
@@ -876,7 +987,7 @@
         <w:pStyle w:val="FirstParagraph"/>
       </w:pPr>
       <w:r>
-        <w:t xml:space="preserve">Microsoft respectfully asks that this document and the associated individual proposal materials be routed to the appropriate Unicode working group and reviewed on their complete technical merits, including evidence, distinctiveness, public utility, image rights, accessibility, and anticipated vendor-support considerations.</w:t>
+        <w:t xml:space="preserve">Microsoft respectfully asks that this document be routed to ESR for the bounded review described above. Microsoft further asks that any associated individual proposal materials be reviewed through the ordinary Emoji process on their complete technical merits, including evidence, distinctiveness, public utility, image rights, accessibility, and anticipated vendor-support considerations. Microsoft sponsorship does not constitute evidence of usage, eligibility, or likely acceptance.</w:t>
       </w:r>
     </w:p>
     <w:p>
@@ -887,8 +998,8 @@
         <w:t xml:space="preserve">The requested working-group output is a recommendation on the maintenance framework and procedural handling of the individual concepts. The working group need not decide every candidate in the same meeting, and no candidate should advance without a complete packet.</w:t>
       </w:r>
     </w:p>
-    <w:bookmarkEnd w:id="15"/>
-    <w:bookmarkStart w:id="16" w:name="boundaries-and-safeguards"/>
+    <w:bookmarkEnd w:id="17"/>
+    <w:bookmarkStart w:id="18" w:name="boundaries-and-safeguards"/>
     <w:p>
       <w:pPr>
         <w:pStyle w:val="Heading2"/>
@@ -981,8 +1092,8 @@
         <w:t xml:space="preserve">No submitted artwork should be treated as required vendor artwork.</w:t>
       </w:r>
     </w:p>
-    <w:bookmarkEnd w:id="16"/>
-    <w:bookmarkStart w:id="20" w:name="references"/>
+    <w:bookmarkEnd w:id="18"/>
+    <w:bookmarkStart w:id="22" w:name="references"/>
     <w:p>
       <w:pPr>
         <w:pStyle w:val="Heading2"/>
@@ -1005,7 +1116,7 @@
       <w:r>
         <w:t xml:space="preserve"> </w:t>
       </w:r>
-      <w:hyperlink r:id="rId17">
+      <w:hyperlink r:id="rId19">
         <w:r>
           <w:rPr>
             <w:rStyle w:val="Hyperlink"/>
@@ -1028,7 +1139,7 @@
       <w:r>
         <w:t xml:space="preserve"> </w:t>
       </w:r>
-      <w:hyperlink r:id="rId18">
+      <w:hyperlink r:id="rId20">
         <w:r>
           <w:rPr>
             <w:rStyle w:val="Hyperlink"/>
@@ -1051,7 +1162,7 @@
       <w:r>
         <w:t xml:space="preserve"> </w:t>
       </w:r>
-      <w:hyperlink r:id="rId19">
+      <w:hyperlink r:id="rId21">
         <w:r>
           <w:rPr>
             <w:rStyle w:val="Hyperlink"/>
@@ -1060,7 +1171,7 @@
         </w:r>
       </w:hyperlink>
     </w:p>
-    <w:bookmarkEnd w:id="20"/>
+    <w:bookmarkEnd w:id="22"/>
     <w:sectPr>
       <w:footnotePr>
         <w:numRestart w:val="eachSect"/>

</xml_diff>

<commit_message>
docs: apply Microsoft style to health emoji L2
</commit_message>
<xml_diff>
--- a/docs/proposals/utc-health-category/health-coverage-maintenance-l2-final.docx
+++ b/docs/proposals/utc-health-category/health-coverage-maintenance-l2-final.docx
@@ -27,7 +27,7 @@
         <w:rPr>
           <w:rStyle w:val="VerbatimChar"/>
         </w:rPr>
-        <w:t xml:space="preserve">Source: David Rhew, Microsoft; Shuhan He</w:t>
+        <w:t xml:space="preserve">Source: David Rhew, Microsoft; Heena Purohit, Microsoft; Shuhan He, MD</w:t>
       </w:r>
       <w:r>
         <w:br/>
@@ -141,7 +141,7 @@
         <w:pStyle w:val="FirstParagraph"/>
       </w:pPr>
       <w:r>
-        <w:t xml:space="preserve">Microsoft respectfully asks the UTC to authorize the Emoji Standard and Research Working Group to conduct a bounded review of health-related emoji coverage and report back with recommendations on scope, prioritization criteria, and procedural handling of individual proposals. The review mandate should address the following five questions:</w:t>
+        <w:t xml:space="preserve">We request that the UTC authorize the Emoji Standard and Research Working Group to conduct a bounded review of health-related emoji coverage and report back with recommendations on scope, prioritization criteria, and procedural handling of individual proposals. The review mandate should address the following five questions:</w:t>
       </w:r>
     </w:p>
     <w:p>
@@ -987,7 +987,7 @@
         <w:pStyle w:val="FirstParagraph"/>
       </w:pPr>
       <w:r>
-        <w:t xml:space="preserve">Microsoft respectfully asks that this document be routed to ESR for the bounded review described above. Microsoft further asks that any associated individual proposal materials be reviewed through the ordinary Emoji process on their complete technical merits, including evidence, distinctiveness, public utility, image rights, accessibility, and anticipated vendor-support considerations. Microsoft sponsorship does not constitute evidence of usage, eligibility, or likely acceptance.</w:t>
+        <w:t xml:space="preserve">We request that this document be routed to ESR for the bounded review described above. Any associated individual proposal materials should be reviewed through the ordinary Emoji process on their complete technical merits, including evidence, distinctiveness, public utility, image rights, accessibility, and anticipated vendor-support considerations. Microsoft sponsorship does not constitute evidence of usage, eligibility, or likely acceptance.</w:t>
       </w:r>
     </w:p>
     <w:p>

</xml_diff>

<commit_message>
docs: redesign L2 PDF in Unicode style
</commit_message>
<xml_diff>
--- a/docs/proposals/utc-health-category/health-coverage-maintenance-l2-final.docx
+++ b/docs/proposals/utc-health-category/health-coverage-maintenance-l2-final.docx
@@ -326,266 +326,114 @@
         <w:t xml:space="preserve">The review should use a coverage matrix with six domains:</w:t>
       </w:r>
     </w:p>
-    <w:tbl>
-      <w:tblPr>
-        <w:tblStyle w:val="Table"/>
-        <w:tblW w:type="auto" w:w="0"/>
-        <w:tblLook w:firstRow="1" w:lastRow="0" w:firstColumn="0" w:lastColumn="0" w:noHBand="0" w:noVBand="0" w:val="0020"/>
-      </w:tblPr>
-      <w:tblGrid>
-        <w:gridCol w:w="2640"/>
-        <w:gridCol w:w="2640"/>
-        <w:gridCol w:w="2640"/>
-      </w:tblGrid>
-      <w:tr>
-        <w:trPr>
-          <w:tblHeader w:val="on"/>
-        </w:trPr>
-        <w:tc>
-          <w:tcPr/>
-          <w:p>
-            <w:pPr>
-              <w:pStyle w:val="Compact"/>
-            </w:pPr>
-            <w:r>
-              <w:t xml:space="preserve">Domain</w:t>
-            </w:r>
-          </w:p>
-        </w:tc>
-        <w:tc>
-          <w:tcPr/>
-          <w:p>
-            <w:pPr>
-              <w:pStyle w:val="Compact"/>
-            </w:pPr>
-            <w:r>
-              <w:t xml:space="preserve">Existing examples</w:t>
-            </w:r>
-          </w:p>
-        </w:tc>
-        <w:tc>
-          <w:tcPr/>
-          <w:p>
-            <w:pPr>
-              <w:pStyle w:val="Compact"/>
-            </w:pPr>
-            <w:r>
-              <w:t xml:space="preserve">Gap questions</w:t>
-            </w:r>
-          </w:p>
-        </w:tc>
-      </w:tr>
-      <w:tr>
-        <w:tc>
-          <w:tcPr/>
-          <w:p>
-            <w:pPr>
-              <w:pStyle w:val="Compact"/>
-            </w:pPr>
-            <w:r>
-              <w:t xml:space="preserve">Anatomy</w:t>
-            </w:r>
-          </w:p>
-        </w:tc>
-        <w:tc>
-          <w:tcPr/>
-          <w:p>
-            <w:pPr>
-              <w:pStyle w:val="Compact"/>
-            </w:pPr>
-            <w:r>
-              <w:t xml:space="preserve">brain, anatomical heart, lungs, tooth, mechanical limbs</w:t>
-            </w:r>
-          </w:p>
-        </w:tc>
-        <w:tc>
-          <w:tcPr/>
-          <w:p>
-            <w:pPr>
-              <w:pStyle w:val="Compact"/>
-            </w:pPr>
-            <w:r>
-              <w:t xml:space="preserve">Are major internal organs and body systems represented distinctly enough for ordinary communication?</w:t>
-            </w:r>
-          </w:p>
-        </w:tc>
-      </w:tr>
-      <w:tr>
-        <w:tc>
-          <w:tcPr/>
-          <w:p>
-            <w:pPr>
-              <w:pStyle w:val="Compact"/>
-            </w:pPr>
-            <w:r>
-              <w:t xml:space="preserve">Diagnostics</w:t>
-            </w:r>
-          </w:p>
-        </w:tc>
-        <w:tc>
-          <w:tcPr/>
-          <w:p>
-            <w:pPr>
-              <w:pStyle w:val="Compact"/>
-            </w:pPr>
-            <w:r>
-              <w:t xml:space="preserve">x-ray, stethoscope, thermometer-related face</w:t>
-            </w:r>
-          </w:p>
-        </w:tc>
-        <w:tc>
-          <w:tcPr/>
-          <w:p>
-            <w:pPr>
-              <w:pStyle w:val="Compact"/>
-            </w:pPr>
-            <w:r>
-              <w:t xml:space="preserve">Are common diagnostic modalities and readings represented without over-specific device branding?</w:t>
-            </w:r>
-          </w:p>
-        </w:tc>
-      </w:tr>
-      <w:tr>
-        <w:tc>
-          <w:tcPr/>
-          <w:p>
-            <w:pPr>
-              <w:pStyle w:val="Compact"/>
-            </w:pPr>
-            <w:r>
-              <w:t xml:space="preserve">Laboratory medicine</w:t>
-            </w:r>
-          </w:p>
-        </w:tc>
-        <w:tc>
-          <w:tcPr/>
-          <w:p>
-            <w:pPr>
-              <w:pStyle w:val="Compact"/>
-            </w:pPr>
-            <w:r>
-              <w:t xml:space="preserve">test tube, petri dish, DNA, microbe</w:t>
-            </w:r>
-          </w:p>
-        </w:tc>
-        <w:tc>
-          <w:tcPr/>
-          <w:p>
-            <w:pPr>
-              <w:pStyle w:val="Compact"/>
-            </w:pPr>
-            <w:r>
-              <w:t xml:space="preserve">Are specimen, cell, blood, and laboratory concepts organized coherently?</w:t>
-            </w:r>
-          </w:p>
-        </w:tc>
-      </w:tr>
-      <w:tr>
-        <w:tc>
-          <w:tcPr/>
-          <w:p>
-            <w:pPr>
-              <w:pStyle w:val="Compact"/>
-            </w:pPr>
-            <w:r>
-              <w:t xml:space="preserve">Medication</w:t>
-            </w:r>
-          </w:p>
-        </w:tc>
-        <w:tc>
-          <w:tcPr/>
-          <w:p>
-            <w:pPr>
-              <w:pStyle w:val="Compact"/>
-            </w:pPr>
-            <w:r>
-              <w:t xml:space="preserve">pill, syringe, drop of blood</w:t>
-            </w:r>
-          </w:p>
-        </w:tc>
-        <w:tc>
-          <w:tcPr/>
-          <w:p>
-            <w:pPr>
-              <w:pStyle w:val="Compact"/>
-            </w:pPr>
-            <w:r>
-              <w:t xml:space="preserve">Are medication-use concepts such as Pill Box and Inhaler independently useful and visually distinct?</w:t>
-            </w:r>
-          </w:p>
-        </w:tc>
-      </w:tr>
-      <w:tr>
-        <w:tc>
-          <w:tcPr/>
-          <w:p>
-            <w:pPr>
-              <w:pStyle w:val="Compact"/>
-            </w:pPr>
-            <w:r>
-              <w:t xml:space="preserve">Emergency care</w:t>
-            </w:r>
-          </w:p>
-        </w:tc>
-        <w:tc>
-          <w:tcPr/>
-          <w:p>
-            <w:pPr>
-              <w:pStyle w:val="Compact"/>
-            </w:pPr>
-            <w:r>
-              <w:t xml:space="preserve">adhesive bandage, crutch, ambulance, hospital</w:t>
-            </w:r>
-          </w:p>
-        </w:tc>
-        <w:tc>
-          <w:tcPr/>
-          <w:p>
-            <w:pPr>
-              <w:pStyle w:val="Compact"/>
-            </w:pPr>
-            <w:r>
-              <w:t xml:space="preserve">Are first-response objects and care actions represented as broad paradigms rather than logos?</w:t>
-            </w:r>
-          </w:p>
-        </w:tc>
-      </w:tr>
-      <w:tr>
-        <w:tc>
-          <w:tcPr/>
-          <w:p>
-            <w:pPr>
-              <w:pStyle w:val="Compact"/>
-            </w:pPr>
-            <w:r>
-              <w:t xml:space="preserve">Clinical equipment</w:t>
-            </w:r>
-          </w:p>
-        </w:tc>
-        <w:tc>
-          <w:tcPr/>
-          <w:p>
-            <w:pPr>
-              <w:pStyle w:val="Compact"/>
-            </w:pPr>
-            <w:r>
-              <w:t xml:space="preserve">stethoscope, x-ray, crutch</w:t>
-            </w:r>
-          </w:p>
-        </w:tc>
-        <w:tc>
-          <w:tcPr/>
-          <w:p>
-            <w:pPr>
-              <w:pStyle w:val="Compact"/>
-            </w:pPr>
-            <w:r>
-              <w:t xml:space="preserve">Which equipment concepts have broad public use, a clear silhouette, and no existing substitute?</w:t>
-            </w:r>
-          </w:p>
-        </w:tc>
-      </w:tr>
-    </w:tbl>
+    <w:p>
+      <w:pPr>
+        <w:pStyle w:val="BodyText"/>
+      </w:pPr>
+      <w:r>
+        <w:rPr>
+          <w:b/>
+          <w:bCs/>
+        </w:rPr>
+        <w:t xml:space="preserve">Anatomy.</w:t>
+      </w:r>
+      <w:r>
+        <w:t xml:space="preserve"> </w:t>
+      </w:r>
+      <w:r>
+        <w:t xml:space="preserve">Brain, anatomical heart, lungs, tooth, and mechanical limbs; assess whether major internal organs and systems are represented distinctly enough for ordinary communication.</w:t>
+      </w:r>
+    </w:p>
+    <w:p>
+      <w:pPr>
+        <w:pStyle w:val="BodyText"/>
+      </w:pPr>
+      <w:r>
+        <w:rPr>
+          <w:b/>
+          <w:bCs/>
+        </w:rPr>
+        <w:t xml:space="preserve">Diagnostics.</w:t>
+      </w:r>
+      <w:r>
+        <w:t xml:space="preserve"> </w:t>
+      </w:r>
+      <w:r>
+        <w:t xml:space="preserve">X-ray, stethoscope, and thermometer-related face; assess common modalities and readings without over-specific device branding.</w:t>
+      </w:r>
+    </w:p>
+    <w:p>
+      <w:pPr>
+        <w:pStyle w:val="BodyText"/>
+      </w:pPr>
+      <w:r>
+        <w:rPr>
+          <w:b/>
+          <w:bCs/>
+        </w:rPr>
+        <w:t xml:space="preserve">Laboratory medicine.</w:t>
+      </w:r>
+      <w:r>
+        <w:t xml:space="preserve"> </w:t>
+      </w:r>
+      <w:r>
+        <w:t xml:space="preserve">Test tube, petri dish, DNA, and microbe; assess whether specimen, cell, blood, and laboratory concepts are organized coherently.</w:t>
+      </w:r>
+    </w:p>
+    <w:p>
+      <w:pPr>
+        <w:pStyle w:val="BodyText"/>
+      </w:pPr>
+      <w:r>
+        <w:rPr>
+          <w:b/>
+          <w:bCs/>
+        </w:rPr>
+        <w:t xml:space="preserve">Medication.</w:t>
+      </w:r>
+      <w:r>
+        <w:t xml:space="preserve"> </w:t>
+      </w:r>
+      <w:r>
+        <w:t xml:space="preserve">Pill, syringe, and drop of blood; assess whether Pill Box and Inhaler are independently useful and visually distinct.</w:t>
+      </w:r>
+    </w:p>
+    <w:p>
+      <w:pPr>
+        <w:pStyle w:val="BodyText"/>
+      </w:pPr>
+      <w:r>
+        <w:rPr>
+          <w:b/>
+          <w:bCs/>
+        </w:rPr>
+        <w:t xml:space="preserve">Emergency care.</w:t>
+      </w:r>
+      <w:r>
+        <w:t xml:space="preserve"> </w:t>
+      </w:r>
+      <w:r>
+        <w:t xml:space="preserve">Adhesive bandage, crutch, ambulance, and hospital; assess first-response objects and care actions as broad paradigms rather than logos.</w:t>
+      </w:r>
+    </w:p>
+    <w:p>
+      <w:pPr>
+        <w:pStyle w:val="BodyText"/>
+      </w:pPr>
+      <w:r>
+        <w:rPr>
+          <w:b/>
+          <w:bCs/>
+        </w:rPr>
+        <w:t xml:space="preserve">Clinical equipment.</w:t>
+      </w:r>
+      <w:r>
+        <w:t xml:space="preserve"> </w:t>
+      </w:r>
+      <w:r>
+        <w:t xml:space="preserve">Stethoscope, x-ray, and crutch; identify equipment concepts with broad public use, clear silhouettes, and no existing substitute.</w:t>
+      </w:r>
+    </w:p>
     <w:p>
       <w:pPr>
         <w:pStyle w:val="BodyText"/>

</xml_diff>

<commit_message>
docs: clarify L2 language and add standards references
</commit_message>
<xml_diff>
--- a/docs/proposals/utc-health-category/health-coverage-maintenance-l2-final.docx
+++ b/docs/proposals/utc-health-category/health-coverage-maintenance-l2-final.docx
@@ -72,7 +72,7 @@
         <w:t xml:space="preserve"> </w:t>
       </w:r>
       <w:r>
-        <w:t xml:space="preserve">Final discussion document for Microsoft review and referral to the Unicode Technical Committee (UTC) and the Emoji Standard and Research Working Group (ESR).</w:t>
+        <w:t xml:space="preserve">Discussion document for referral to the Unicode Technical Committee (UTC) and the Emoji Standard and Research Working Group (ESR).</w:t>
       </w:r>
     </w:p>
     <w:bookmarkStart w:id="9" w:name="executive-summary"/>
@@ -105,7 +105,7 @@
         <w:pStyle w:val="BodyText"/>
       </w:pPr>
       <w:r>
-        <w:t xml:space="preserve">No character is requested, approved, or prioritized by this document. Each concept remains subject to the current Unicode Emoji proposal requirements, including public evidence, distinctiveness, exclusion-factor analysis, image rights, and the normal submission form.</w:t>
+        <w:t xml:space="preserve">This document addresses review and organization. Individual concepts remain subject to the current Unicode Emoji proposal requirements.</w:t>
       </w:r>
     </w:p>
     <w:bookmarkEnd w:id="9"/>
@@ -123,7 +123,7 @@
         <w:pStyle w:val="FirstParagraph"/>
       </w:pPr>
       <w:r>
-        <w:t xml:space="preserve">The 2026 Emoji proposal window is open through July 31, 2026. Several health-related concepts have prior proposal history, and the current project drafts are being rebuilt against the current evidence, image-rights, and submission requirements. A bounded maintenance review would improve process coherence while leaving every individual concept to the normal proposal process.</w:t>
+        <w:t xml:space="preserve">The 2026 Emoji proposal window is open through July 31, 2026. Several health-related concepts have prior proposal history, and current submissions are being prepared under the evidence, image-rights, and submission requirements in force for this cycle.</w:t>
       </w:r>
     </w:p>
     <w:bookmarkEnd w:id="10"/>
@@ -263,13 +263,13 @@
       </w:r>
     </w:p>
     <w:bookmarkEnd w:id="11"/>
-    <w:bookmarkStart w:id="12" w:name="two-track-structure"/>
+    <w:bookmarkStart w:id="12" w:name="review-structure"/>
     <w:p>
       <w:pPr>
         <w:pStyle w:val="Heading2"/>
       </w:pPr>
       <w:r>
-        <w:t xml:space="preserve">Two-track structure</w:t>
+        <w:t xml:space="preserve">Review structure</w:t>
       </w:r>
     </w:p>
     <w:p>
@@ -281,7 +281,7 @@
           <w:b/>
           <w:bCs/>
         </w:rPr>
-        <w:t xml:space="preserve">Track A - standards maintenance.</w:t>
+        <w:t xml:space="preserve">Standards review.</w:t>
       </w:r>
       <w:r>
         <w:t xml:space="preserve"> </w:t>
@@ -299,13 +299,13 @@
           <w:b/>
           <w:bCs/>
         </w:rPr>
-        <w:t xml:space="preserve">Track B - individual proposals.</w:t>
-      </w:r>
-      <w:r>
-        <w:t xml:space="preserve"> </w:t>
-      </w:r>
-      <w:r>
-        <w:t xml:space="preserve">Each candidate is prepared and submitted as a separate, complete Unicode Emoji proposal. Track B does not depend on creation of a new category, and Track A does not pre-approve any candidate.</w:t>
+        <w:t xml:space="preserve">Individual proposals.</w:t>
+      </w:r>
+      <w:r>
+        <w:t xml:space="preserve"> </w:t>
+      </w:r>
+      <w:r>
+        <w:t xml:space="preserve">Each candidate is prepared and submitted as a separate, complete Unicode Emoji proposal. The standards review does not pre-approve any candidate.</w:t>
       </w:r>
     </w:p>
     <w:bookmarkEnd w:id="12"/>
@@ -439,7 +439,7 @@
         <w:pStyle w:val="BodyText"/>
       </w:pPr>
       <w:r>
-        <w:t xml:space="preserve">The matrix is an analytical tool. It does not imply that every row or gap should produce a character.</w:t>
+        <w:t xml:space="preserve">The matrix organizes the review; it does not imply that every gap should produce a character.</w:t>
       </w:r>
     </w:p>
     <w:bookmarkEnd w:id="13"/>
@@ -703,7 +703,7 @@
         <w:pStyle w:val="FirstParagraph"/>
       </w:pPr>
       <w:r>
-        <w:t xml:space="preserve">The individual submission is the operative Unicode artifact. Each packet must be complete on its own and publicly accessible as a PDF. The L2 document may explain why the domain deserves a coordinated review, but it cannot carry missing evidence for a candidate.</w:t>
+        <w:t xml:space="preserve">Each individual submission must be complete on its own and publicly accessible as a PDF. This L2 explains the domain-level review; it does not replace evidence for an individual candidate.</w:t>
       </w:r>
     </w:p>
     <w:p>
@@ -719,7 +719,7 @@
         <w:pStyle w:val="BodyText"/>
       </w:pPr>
       <w:r>
-        <w:t xml:space="preserve">The current project drafts and evidence work are inputs, not substitutes for the final packet. Every TODO, placeholder, pending screenshot, unresolved rights statement, and unverified eligibility date is a release blocker.</w:t>
+        <w:t xml:space="preserve">Every submission must be complete: no TODOs, placeholders, pending screenshots, unresolved rights statements, or unverified eligibility dates.</w:t>
       </w:r>
     </w:p>
     <w:bookmarkEnd w:id="15"/>
@@ -737,7 +737,7 @@
         <w:pStyle w:val="FirstParagraph"/>
       </w:pPr>
       <w:r>
-        <w:t xml:space="preserve">Vendor participation should be optional, transparent, non-binding, and non-exclusive. It should be bounded to:</w:t>
+        <w:t xml:space="preserve">Vendor participation should be optional, transparent, non-binding, and non-exclusive. It may include:</w:t>
       </w:r>
     </w:p>
     <w:p>
@@ -817,7 +817,7 @@
         <w:pStyle w:val="FirstParagraph"/>
       </w:pPr>
       <w:r>
-        <w:t xml:space="preserve">Vendor review is not a vote, a frequency statistic, a substitute for Unicode evidence, a request for exact artwork, an exclusive endorsement, or a commitment to ship an encoded character.</w:t>
+        <w:t xml:space="preserve">Vendor review does not replace Unicode evidence, request exact artwork, or commit a vendor to ship an encoded character.</w:t>
       </w:r>
     </w:p>
     <w:bookmarkEnd w:id="16"/>
@@ -865,7 +865,7 @@
         </w:numPr>
       </w:pPr>
       <w:r>
-        <w:t xml:space="preserve">This is not a request for a top-level Health group as a prerequisite to encoding.</w:t>
+        <w:t xml:space="preserve">The review does not require creation of a top-level Health group.</w:t>
       </w:r>
     </w:p>
     <w:p>
@@ -877,7 +877,7 @@
         </w:numPr>
       </w:pPr>
       <w:r>
-        <w:t xml:space="preserve">This is not a request to encode a comprehensive anatomy taxonomy.</w:t>
+        <w:t xml:space="preserve">The review does not propose a comprehensive anatomy taxonomy.</w:t>
       </w:r>
     </w:p>
     <w:p>
@@ -889,7 +889,7 @@
         </w:numPr>
       </w:pPr>
       <w:r>
-        <w:t xml:space="preserve">This is not a bundled submission or a request to bypass the normal Emoji proposal form.</w:t>
+        <w:t xml:space="preserve">Individual concepts will use the normal Emoji proposal form.</w:t>
       </w:r>
     </w:p>
     <w:p>
@@ -901,7 +901,7 @@
         </w:numPr>
       </w:pPr>
       <w:r>
-        <w:t xml:space="preserve">Professional society letters provide legitimacy and domain context; they are not frequency evidence.</w:t>
+        <w:t xml:space="preserve">Professional society letters provide domain context; they are not frequency evidence.</w:t>
       </w:r>
     </w:p>
     <w:p>
@@ -913,7 +913,7 @@
         </w:numPr>
       </w:pPr>
       <w:r>
-        <w:t xml:space="preserve">Medical prevalence, clinical importance, and patient need explain durability and utility; they do not replace Unicode's required usage evidence.</w:t>
+        <w:t xml:space="preserve">Medical prevalence and clinical importance do not replace Unicode's required usage evidence.</w:t>
       </w:r>
     </w:p>
     <w:p>
@@ -925,7 +925,7 @@
         </w:numPr>
       </w:pPr>
       <w:r>
-        <w:t xml:space="preserve">Eligibility for a previously declined concept must be checked against Unicode's operative date rule immediately before filing.</w:t>
+        <w:t xml:space="preserve">Previously declined concepts require an eligibility check immediately before filing.</w:t>
       </w:r>
     </w:p>
     <w:p>
@@ -937,11 +937,11 @@
         </w:numPr>
       </w:pPr>
       <w:r>
-        <w:t xml:space="preserve">No submitted artwork should be treated as required vendor artwork.</w:t>
+        <w:t xml:space="preserve">Submitted artwork is a reference paradigm, not required vendor artwork.</w:t>
       </w:r>
     </w:p>
     <w:bookmarkEnd w:id="18"/>
-    <w:bookmarkStart w:id="22" w:name="references"/>
+    <w:bookmarkStart w:id="28" w:name="references"/>
     <w:p>
       <w:pPr>
         <w:pStyle w:val="Heading2"/>
@@ -982,12 +982,150 @@
         </w:numPr>
       </w:pPr>
       <w:r>
+        <w:t xml:space="preserve">Unicode, Unicode Standard Annex #51, Unicode Emoji:</w:t>
+      </w:r>
+      <w:r>
+        <w:t xml:space="preserve"> </w:t>
+      </w:r>
+      <w:hyperlink r:id="rId20">
+        <w:r>
+          <w:rPr>
+            <w:rStyle w:val="Hyperlink"/>
+          </w:rPr>
+          <w:t xml:space="preserve">https://www.unicode.org/reports/tr51/</w:t>
+        </w:r>
+      </w:hyperlink>
+    </w:p>
+    <w:p>
+      <w:pPr>
+        <w:pStyle w:val="Compact"/>
+        <w:numPr>
+          <w:ilvl w:val="0"/>
+          <w:numId w:val="1005"/>
+        </w:numPr>
+      </w:pPr>
+      <w:r>
+        <w:t xml:space="preserve">Unicode, Emoji Ordering:</w:t>
+      </w:r>
+      <w:r>
+        <w:t xml:space="preserve"> </w:t>
+      </w:r>
+      <w:hyperlink r:id="rId21">
+        <w:r>
+          <w:rPr>
+            <w:rStyle w:val="Hyperlink"/>
+          </w:rPr>
+          <w:t xml:space="preserve">https://unicode.org/emoji/charts/emoji-ordering.html</w:t>
+        </w:r>
+      </w:hyperlink>
+    </w:p>
+    <w:p>
+      <w:pPr>
+        <w:pStyle w:val="Compact"/>
+        <w:numPr>
+          <w:ilvl w:val="0"/>
+          <w:numId w:val="1005"/>
+        </w:numPr>
+      </w:pPr>
+      <w:r>
+        <w:t xml:space="preserve">Unicode, Emoji Proposals Status:</w:t>
+      </w:r>
+      <w:r>
+        <w:t xml:space="preserve"> </w:t>
+      </w:r>
+      <w:hyperlink r:id="rId22">
+        <w:r>
+          <w:rPr>
+            <w:rStyle w:val="Hyperlink"/>
+          </w:rPr>
+          <w:t xml:space="preserve">https://unicode.org/emoji/emoji-proposals-status.html</w:t>
+        </w:r>
+      </w:hyperlink>
+    </w:p>
+    <w:p>
+      <w:pPr>
+        <w:pStyle w:val="Compact"/>
+        <w:numPr>
+          <w:ilvl w:val="0"/>
+          <w:numId w:val="1005"/>
+        </w:numPr>
+      </w:pPr>
+      <w:r>
+        <w:t xml:space="preserve">Unicode, Emoji Standard and Research Working Group Report for UTC #186:</w:t>
+      </w:r>
+      <w:r>
+        <w:t xml:space="preserve"> </w:t>
+      </w:r>
+      <w:hyperlink r:id="rId23">
+        <w:r>
+          <w:rPr>
+            <w:rStyle w:val="Hyperlink"/>
+          </w:rPr>
+          <w:t xml:space="preserve">https://www.unicode.org/L2/L2026/26008r-esr-report-utc186.pdf</w:t>
+        </w:r>
+      </w:hyperlink>
+    </w:p>
+    <w:p>
+      <w:pPr>
+        <w:pStyle w:val="Compact"/>
+        <w:numPr>
+          <w:ilvl w:val="0"/>
+          <w:numId w:val="1005"/>
+        </w:numPr>
+      </w:pPr>
+      <w:r>
+        <w:t xml:space="preserve">Unicode, Emoji Submission FAQ:</w:t>
+      </w:r>
+      <w:r>
+        <w:t xml:space="preserve"> </w:t>
+      </w:r>
+      <w:hyperlink r:id="rId24">
+        <w:r>
+          <w:rPr>
+            <w:rStyle w:val="Hyperlink"/>
+          </w:rPr>
+          <w:t xml:space="preserve">https://www.unicode.org/faq/emoji_submission.html</w:t>
+        </w:r>
+      </w:hyperlink>
+    </w:p>
+    <w:p>
+      <w:pPr>
+        <w:pStyle w:val="Compact"/>
+        <w:numPr>
+          <w:ilvl w:val="0"/>
+          <w:numId w:val="1005"/>
+        </w:numPr>
+      </w:pPr>
+      <w:r>
+        <w:t xml:space="preserve">Unicode, Emoji Proposal Agreement and License:</w:t>
+      </w:r>
+      <w:r>
+        <w:t xml:space="preserve"> </w:t>
+      </w:r>
+      <w:hyperlink r:id="rId25">
+        <w:r>
+          <w:rPr>
+            <w:rStyle w:val="Hyperlink"/>
+          </w:rPr>
+          <w:t xml:space="preserve">https://www.unicode.org/emoji/emoji-proposal-agreement.pdf</w:t>
+        </w:r>
+      </w:hyperlink>
+    </w:p>
+    <w:p>
+      <w:pPr>
+        <w:pStyle w:val="Compact"/>
+        <w:numPr>
+          <w:ilvl w:val="0"/>
+          <w:numId w:val="1005"/>
+        </w:numPr>
+      </w:pPr>
+      <w:r>
         <w:t xml:space="preserve">Unicode, Pending Document Submission:</w:t>
       </w:r>
       <w:r>
         <w:t xml:space="preserve"> </w:t>
       </w:r>
-      <w:hyperlink r:id="rId20">
+      <w:hyperlink r:id="rId26">
         <w:r>
           <w:rPr>
             <w:rStyle w:val="Hyperlink"/>
@@ -1010,7 +1148,7 @@
       <w:r>
         <w:t xml:space="preserve"> </w:t>
       </w:r>
-      <w:hyperlink r:id="rId21">
+      <w:hyperlink r:id="rId27">
         <w:r>
           <w:rPr>
             <w:rStyle w:val="Hyperlink"/>
@@ -1019,7 +1157,7 @@
         </w:r>
       </w:hyperlink>
     </w:p>
-    <w:bookmarkEnd w:id="22"/>
+    <w:bookmarkEnd w:id="28"/>
     <w:sectPr>
       <w:footnotePr>
         <w:numRestart w:val="eachSect"/>

</xml_diff>

<commit_message>
docs: harden L2 against Unicode review
</commit_message>
<xml_diff>
--- a/docs/proposals/utc-health-category/health-coverage-maintenance-l2-final.docx
+++ b/docs/proposals/utc-health-category/health-coverage-maintenance-l2-final.docx
@@ -45,7 +45,7 @@
         <w:rPr>
           <w:rStyle w:val="VerbatimChar"/>
         </w:rPr>
-        <w:t xml:space="preserve">Status: Individual Contribution</w:t>
+        <w:t xml:space="preserve">Status: Individual Contribution; affiliations are provided for identification</w:t>
       </w:r>
       <w:r>
         <w:br/>
@@ -89,7 +89,7 @@
         <w:pStyle w:val="FirstParagraph"/>
       </w:pPr>
       <w:r>
-        <w:t xml:space="preserve">Health-related emoji coverage is now a coherent standards-maintenance problem. Health concepts are distributed across anatomy, diagnostic, laboratory, medication, emergency-care, and clinical-equipment contexts, while users and implementers encounter them as one practical communication domain. The issue is not that every medical concept should become an emoji. The issue is that the current coverage and review process does not provide a clear way to identify gaps, compare candidates, or coordinate vendor support.</w:t>
+        <w:t xml:space="preserve">Health-related emoji coverage presents a coherent review question. Health concepts are distributed across anatomy, diagnostic, laboratory, medication, emergency-care, and clinical-equipment contexts. This document uses “standards maintenance” narrowly to mean review of existing emoji organization, coverage analysis, and proposal-handling guidance. It does not mean automatic addition of characters.</w:t>
       </w:r>
     </w:p>
     <w:p>
@@ -97,7 +97,7 @@
         <w:pStyle w:val="BodyText"/>
       </w:pPr>
       <w:r>
-        <w:t xml:space="preserve">This document asks the UTC to authorize ESR to review the maintenance issue and report back on the organization of the domain, prioritization criteria, procedural handling of individual concepts, and bounded vendor support for design, accessibility, rights, evidence, and anticipated implementation.</w:t>
+        <w:t xml:space="preserve">This document asks the UTC to authorize ESR to prepare a report describing how existing health-related emoji are represented in Unicode emoji data and ordering, whether the current organization creates a material discoverability problem, how the existing Emoji selection factors apply to health-related concepts, and what procedural guidance, if any, should be reported to the UTC.</w:t>
       </w:r>
     </w:p>
     <w:p>
@@ -123,7 +123,7 @@
         <w:pStyle w:val="FirstParagraph"/>
       </w:pPr>
       <w:r>
-        <w:t xml:space="preserve">The 2026 Emoji proposal window is open through July 31, 2026. Several health-related concepts have prior proposal history, and current submissions are being prepared under the evidence, image-rights, and submission requirements in force for this cycle.</w:t>
+        <w:t xml:space="preserve">The 2026 Emoji proposal window is open through July 31, 2026. Several health-related concepts have prior proposal history, and current submissions are being prepared under the evidence, image-rights, and submission requirements in force for this cycle. The current Unicode Emoji Ordering data provides a reproducible starting point for reviewing where health-related concepts appear today.</w:t>
       </w:r>
     </w:p>
     <w:bookmarkEnd w:id="10"/>
@@ -141,7 +141,7 @@
         <w:pStyle w:val="FirstParagraph"/>
       </w:pPr>
       <w:r>
-        <w:t xml:space="preserve">We request that the UTC authorize the Emoji Standard and Research Working Group to conduct a bounded review of health-related emoji coverage and report back with recommendations on scope, prioritization criteria, and procedural handling of individual proposals. The review mandate should address the following five questions:</w:t>
+        <w:t xml:space="preserve">We request that the UTC authorize the Emoji Standard and Research Working Group to prepare a report on health-related emoji coverage and return recommendations on organization, application of the existing selection factors, and procedural handling of individual proposals. The review mandate should address the following five questions:</w:t>
       </w:r>
     </w:p>
     <w:p>
@@ -157,7 +157,7 @@
           <w:b/>
           <w:bCs/>
         </w:rPr>
-        <w:t xml:space="preserve">Recognize health-related emoji coverage as a coherent standards-maintenance issue.</w:t>
+        <w:t xml:space="preserve">Recognize health-related emoji coverage as a coherent review question.</w:t>
       </w:r>
       <w:r>
         <w:t xml:space="preserve"> </w:t>
@@ -201,13 +201,13 @@
           <w:b/>
           <w:bCs/>
         </w:rPr>
-        <w:t xml:space="preserve">Establish criteria for prioritizing missing concepts.</w:t>
-      </w:r>
-      <w:r>
-        <w:t xml:space="preserve"> </w:t>
-      </w:r>
-      <w:r>
-        <w:t xml:space="preserve">Criteria should include broad and reproducible usage evidence, distinctiveness, multiple durable meanings, combinability, category completion, non-duplication, visual legibility, accessibility, rights readiness, and implementation feasibility.</w:t>
+        <w:t xml:space="preserve">Assess how the existing Emoji selection factors apply.</w:t>
+      </w:r>
+      <w:r>
+        <w:t xml:space="preserve"> </w:t>
+      </w:r>
+      <w:r>
+        <w:t xml:space="preserve">The review should consider usage evidence, distinctiveness, multiple durable meanings, combinability, category completion, non-duplication, visual legibility, and the exclusion factors already published by Unicode.</w:t>
       </w:r>
     </w:p>
     <w:p>
@@ -229,7 +229,7 @@
         <w:t xml:space="preserve"> </w:t>
       </w:r>
       <w:r>
-        <w:t xml:space="preserve">A coverage review must not become a bundled encoding request. Kidney, liver, stomach, EKG/ECG, white blood cell, Pill Box, Inhaler, First Aid Kit, Blood Bag, IV Bag, Leg Cast, Weight Scale, and any other concept must be evaluated in its own complete submission.</w:t>
+        <w:t xml:space="preserve">A coverage review must not become a bundled encoding request. Individual concepts must be evaluated in their own complete submissions.</w:t>
       </w:r>
     </w:p>
     <w:p>
@@ -245,13 +245,13 @@
           <w:b/>
           <w:bCs/>
         </w:rPr>
-        <w:t xml:space="preserve">Clarify vendor support.</w:t>
-      </w:r>
-      <w:r>
-        <w:t xml:space="preserve"> </w:t>
-      </w:r>
-      <w:r>
-        <w:t xml:space="preserve">Vendors may contribute design review, accessibility testing, rights and provenance information, evidence reproducibility, and anticipated implementation planning without asking the Consortium to adopt vendor artwork or pre-commit to encoding.</w:t>
+        <w:t xml:space="preserve">Clarify optional vendor input.</w:t>
+      </w:r>
+      <w:r>
+        <w:t xml:space="preserve"> </w:t>
+      </w:r>
+      <w:r>
+        <w:t xml:space="preserve">Vendors may provide non-binding comments on visual legibility, accessibility, platform-neutrality, and implementation considerations. Submitters remain responsible for evidence, licensing, and proposal completeness.</w:t>
       </w:r>
     </w:p>
     <w:p>
@@ -259,7 +259,7 @@
         <w:pStyle w:val="FirstParagraph"/>
       </w:pPr>
       <w:r>
-        <w:t xml:space="preserve">The requested outcome is an ESR recommendation and documented review framework, not automatic approval. The UTC need not decide every candidate in the same meeting.</w:t>
+        <w:t xml:space="preserve">The requested outcome is an ESR report and recommendation on the review framework. It is not a request for automatic approval of any character.</w:t>
       </w:r>
     </w:p>
     <w:bookmarkEnd w:id="11"/>
@@ -287,7 +287,7 @@
         <w:t xml:space="preserve"> </w:t>
       </w:r>
       <w:r>
-        <w:t xml:space="preserve">ESR reviews the organization of existing health-related emoji, the six-domain coverage framework, prioritization criteria, and any process recommendations that should be reported to the UTC.</w:t>
+        <w:t xml:space="preserve">ESR reviews the organization of existing health-related emoji, the six-domain coverage framework, the application of existing selection factors, and any process recommendations that should be reported to the UTC.</w:t>
       </w:r>
     </w:p>
     <w:p>
@@ -305,7 +305,7 @@
         <w:t xml:space="preserve"> </w:t>
       </w:r>
       <w:r>
-        <w:t xml:space="preserve">Each candidate is prepared and submitted as a separate, complete Unicode Emoji proposal. The standards review does not pre-approve any candidate.</w:t>
+        <w:t xml:space="preserve">Each candidate is prepared and submitted as a separate, complete Unicode Emoji proposal. The standards review does not pre-approve any candidate. Illustrative examples are listed in Appendix A; they are not requested for decision by this document.</w:t>
       </w:r>
     </w:p>
     <w:bookmarkEnd w:id="12"/>
@@ -785,7 +785,7 @@
         </w:numPr>
       </w:pPr>
       <w:r>
-        <w:t xml:space="preserve">confirm that example images can be licensed under the Consortium's requirements;</w:t>
+        <w:t xml:space="preserve">provide anticipated implementation considerations; and</w:t>
       </w:r>
     </w:p>
     <w:p>
@@ -797,18 +797,6 @@
         </w:numPr>
       </w:pPr>
       <w:r>
-        <w:t xml:space="preserve">provide anticipated implementation considerations without promising adoption; and</w:t>
-      </w:r>
-    </w:p>
-    <w:p>
-      <w:pPr>
-        <w:pStyle w:val="Compact"/>
-        <w:numPr>
-          <w:ilvl w:val="0"/>
-          <w:numId w:val="1003"/>
-        </w:numPr>
-      </w:pPr>
-      <w:r>
         <w:t xml:space="preserve">return technical comments through the normal UTC/ESR process.</w:t>
       </w:r>
     </w:p>
@@ -817,7 +805,7 @@
         <w:pStyle w:val="FirstParagraph"/>
       </w:pPr>
       <w:r>
-        <w:t xml:space="preserve">Vendor review does not replace Unicode evidence, request exact artwork, or commit a vendor to ship an encoded character.</w:t>
+        <w:t xml:space="preserve">Submitters remain responsible for Unicode evidence, licensing, and proposal completeness. Vendor review does not request exact artwork or commit a vendor to ship an encoded character.</w:t>
       </w:r>
     </w:p>
     <w:bookmarkEnd w:id="16"/>
@@ -835,7 +823,7 @@
         <w:pStyle w:val="FirstParagraph"/>
       </w:pPr>
       <w:r>
-        <w:t xml:space="preserve">We request that this document be routed to ESR for the bounded review described above. Any associated individual proposal materials should be reviewed through the ordinary Emoji process on their complete technical merits, including evidence, distinctiveness, public utility, image rights, accessibility, and anticipated vendor-support considerations. Microsoft sponsorship does not constitute evidence of usage, eligibility, or likely acceptance.</w:t>
+        <w:t xml:space="preserve">We request that this document be routed to ESR for the report described above. Any associated individual proposal materials should be reviewed through the ordinary Emoji process under the published criteria. The affiliations listed in this document identify the authors; they do not replace the evidence required for an individual proposal.</w:t>
       </w:r>
     </w:p>
     <w:p>
@@ -843,7 +831,7 @@
         <w:pStyle w:val="BodyText"/>
       </w:pPr>
       <w:r>
-        <w:t xml:space="preserve">The requested working-group output is a recommendation on the maintenance framework and procedural handling of the individual concepts. The working group need not decide every candidate in the same meeting, and no candidate should advance without a complete packet.</w:t>
+        <w:t xml:space="preserve">The requested working-group output is a report and recommendation on organization, application of the existing selection factors, and procedural handling of individual concepts.</w:t>
       </w:r>
     </w:p>
     <w:bookmarkEnd w:id="17"/>
@@ -941,12 +929,181 @@
       </w:r>
     </w:p>
     <w:bookmarkEnd w:id="18"/>
-    <w:bookmarkStart w:id="28" w:name="references"/>
+    <w:bookmarkStart w:id="19" w:name="Xeceb17ef62f4b1dd11b32a7f3fe9de5610f88e4"/>
     <w:p>
       <w:pPr>
         <w:pStyle w:val="Heading2"/>
       </w:pPr>
       <w:r>
+        <w:t xml:space="preserve">Appendix A: Illustrative concepts for the separate proposal track</w:t>
+      </w:r>
+    </w:p>
+    <w:p>
+      <w:pPr>
+        <w:pStyle w:val="FirstParagraph"/>
+      </w:pPr>
+      <w:r>
+        <w:t xml:space="preserve">The following concepts illustrate the types of gaps that may be examined in separate submissions. This list is not a bundled request, a priority ranking, or a request for action by the UTC in this document:</w:t>
+      </w:r>
+    </w:p>
+    <w:p>
+      <w:pPr>
+        <w:pStyle w:val="Compact"/>
+        <w:numPr>
+          <w:ilvl w:val="0"/>
+          <w:numId w:val="1005"/>
+        </w:numPr>
+      </w:pPr>
+      <w:r>
+        <w:t xml:space="preserve">Anatomy: kidney, liver, stomach.</w:t>
+      </w:r>
+    </w:p>
+    <w:p>
+      <w:pPr>
+        <w:pStyle w:val="Compact"/>
+        <w:numPr>
+          <w:ilvl w:val="0"/>
+          <w:numId w:val="1005"/>
+        </w:numPr>
+      </w:pPr>
+      <w:r>
+        <w:t xml:space="preserve">Diagnostics and laboratory medicine: EKG/ECG and white blood cell.</w:t>
+      </w:r>
+    </w:p>
+    <w:p>
+      <w:pPr>
+        <w:pStyle w:val="Compact"/>
+        <w:numPr>
+          <w:ilvl w:val="0"/>
+          <w:numId w:val="1005"/>
+        </w:numPr>
+      </w:pPr>
+      <w:r>
+        <w:t xml:space="preserve">Medication: Pill Box and Inhaler.</w:t>
+      </w:r>
+    </w:p>
+    <w:p>
+      <w:pPr>
+        <w:pStyle w:val="Compact"/>
+        <w:numPr>
+          <w:ilvl w:val="0"/>
+          <w:numId w:val="1005"/>
+        </w:numPr>
+      </w:pPr>
+      <w:r>
+        <w:t xml:space="preserve">Emergency care and clinical equipment: First Aid Kit, Blood Bag, IV Bag, Leg Cast, and Weight Scale.</w:t>
+      </w:r>
+    </w:p>
+    <w:bookmarkEnd w:id="19"/>
+    <w:bookmarkStart w:id="23" w:name="Xb5a2246859aea1ac8d5db97db9551b28c9dfb59"/>
+    <w:p>
+      <w:pPr>
+        <w:pStyle w:val="Heading2"/>
+      </w:pPr>
+      <w:r>
+        <w:t xml:space="preserve">Appendix B: Factual basis for the coverage review</w:t>
+      </w:r>
+    </w:p>
+    <w:p>
+      <w:pPr>
+        <w:pStyle w:val="FirstParagraph"/>
+      </w:pPr>
+      <w:r>
+        <w:t xml:space="preserve">The coverage review should begin with the current Unicode Emoji Ordering data and the current emoji list. The authors' working inventory records each relevant emoji's Unicode name, code point, group, subgroup, and rationale for inclusion in the health-related review. The inventory is a starting point for ESR review, not a claim that Unicode should move or encode every listed item.</w:t>
+      </w:r>
+    </w:p>
+    <w:p>
+      <w:pPr>
+        <w:pStyle w:val="BodyText"/>
+      </w:pPr>
+      <w:r>
+        <w:t xml:space="preserve">Current source data:</w:t>
+      </w:r>
+    </w:p>
+    <w:p>
+      <w:pPr>
+        <w:pStyle w:val="Compact"/>
+        <w:numPr>
+          <w:ilvl w:val="0"/>
+          <w:numId w:val="1006"/>
+        </w:numPr>
+      </w:pPr>
+      <w:r>
+        <w:t xml:space="preserve">Unicode Emoji Ordering:</w:t>
+      </w:r>
+      <w:r>
+        <w:t xml:space="preserve"> </w:t>
+      </w:r>
+      <w:hyperlink r:id="rId20">
+        <w:r>
+          <w:rPr>
+            <w:rStyle w:val="Hyperlink"/>
+          </w:rPr>
+          <w:t xml:space="preserve">https://unicode.org/emoji/charts/emoji-ordering.html</w:t>
+        </w:r>
+      </w:hyperlink>
+    </w:p>
+    <w:p>
+      <w:pPr>
+        <w:pStyle w:val="Compact"/>
+        <w:numPr>
+          <w:ilvl w:val="0"/>
+          <w:numId w:val="1006"/>
+        </w:numPr>
+      </w:pPr>
+      <w:r>
+        <w:t xml:space="preserve">Unicode Emoji List:</w:t>
+      </w:r>
+      <w:r>
+        <w:t xml:space="preserve"> </w:t>
+      </w:r>
+      <w:hyperlink r:id="rId21">
+        <w:r>
+          <w:rPr>
+            <w:rStyle w:val="Hyperlink"/>
+          </w:rPr>
+          <w:t xml:space="preserve">https://unicode.org/emoji/charts/emoji-list.html</w:t>
+        </w:r>
+      </w:hyperlink>
+    </w:p>
+    <w:p>
+      <w:pPr>
+        <w:pStyle w:val="Compact"/>
+        <w:numPr>
+          <w:ilvl w:val="0"/>
+          <w:numId w:val="1006"/>
+        </w:numPr>
+      </w:pPr>
+      <w:r>
+        <w:t xml:space="preserve">Unicode Standard Annex #51, Unicode Emoji:</w:t>
+      </w:r>
+      <w:r>
+        <w:t xml:space="preserve"> </w:t>
+      </w:r>
+      <w:hyperlink r:id="rId22">
+        <w:r>
+          <w:rPr>
+            <w:rStyle w:val="Hyperlink"/>
+          </w:rPr>
+          <w:t xml:space="preserve">https://www.unicode.org/reports/tr51/</w:t>
+        </w:r>
+      </w:hyperlink>
+    </w:p>
+    <w:p>
+      <w:pPr>
+        <w:pStyle w:val="FirstParagraph"/>
+      </w:pPr>
+      <w:r>
+        <w:t xml:space="preserve">The review should verify the inventory against the current released data before relying on counts or group assignments.</w:t>
+      </w:r>
+    </w:p>
+    <w:bookmarkEnd w:id="23"/>
+    <w:bookmarkStart w:id="31" w:name="references"/>
+    <w:p>
+      <w:pPr>
+        <w:pStyle w:val="Heading2"/>
+      </w:pPr>
+      <w:r>
         <w:t xml:space="preserve">References</w:t>
       </w:r>
     </w:p>
@@ -955,7 +1112,7 @@
         <w:pStyle w:val="Compact"/>
         <w:numPr>
           <w:ilvl w:val="0"/>
-          <w:numId w:val="1005"/>
+          <w:numId w:val="1007"/>
         </w:numPr>
       </w:pPr>
       <w:r>
@@ -964,7 +1121,7 @@
       <w:r>
         <w:t xml:space="preserve"> </w:t>
       </w:r>
-      <w:hyperlink r:id="rId19">
+      <w:hyperlink r:id="rId24">
         <w:r>
           <w:rPr>
             <w:rStyle w:val="Hyperlink"/>
@@ -978,7 +1135,7 @@
         <w:pStyle w:val="Compact"/>
         <w:numPr>
           <w:ilvl w:val="0"/>
-          <w:numId w:val="1005"/>
+          <w:numId w:val="1007"/>
         </w:numPr>
       </w:pPr>
       <w:r>
@@ -987,7 +1144,7 @@
       <w:r>
         <w:t xml:space="preserve"> </w:t>
       </w:r>
-      <w:hyperlink r:id="rId20">
+      <w:hyperlink r:id="rId22">
         <w:r>
           <w:rPr>
             <w:rStyle w:val="Hyperlink"/>
@@ -1001,7 +1158,7 @@
         <w:pStyle w:val="Compact"/>
         <w:numPr>
           <w:ilvl w:val="0"/>
-          <w:numId w:val="1005"/>
+          <w:numId w:val="1007"/>
         </w:numPr>
       </w:pPr>
       <w:r>
@@ -1010,7 +1167,7 @@
       <w:r>
         <w:t xml:space="preserve"> </w:t>
       </w:r>
-      <w:hyperlink r:id="rId21">
+      <w:hyperlink r:id="rId20">
         <w:r>
           <w:rPr>
             <w:rStyle w:val="Hyperlink"/>
@@ -1024,7 +1181,7 @@
         <w:pStyle w:val="Compact"/>
         <w:numPr>
           <w:ilvl w:val="0"/>
-          <w:numId w:val="1005"/>
+          <w:numId w:val="1007"/>
         </w:numPr>
       </w:pPr>
       <w:r>
@@ -1033,7 +1190,7 @@
       <w:r>
         <w:t xml:space="preserve"> </w:t>
       </w:r>
-      <w:hyperlink r:id="rId22">
+      <w:hyperlink r:id="rId25">
         <w:r>
           <w:rPr>
             <w:rStyle w:val="Hyperlink"/>
@@ -1047,7 +1204,7 @@
         <w:pStyle w:val="Compact"/>
         <w:numPr>
           <w:ilvl w:val="0"/>
-          <w:numId w:val="1005"/>
+          <w:numId w:val="1007"/>
         </w:numPr>
       </w:pPr>
       <w:r>
@@ -1056,7 +1213,7 @@
       <w:r>
         <w:t xml:space="preserve"> </w:t>
       </w:r>
-      <w:hyperlink r:id="rId23">
+      <w:hyperlink r:id="rId26">
         <w:r>
           <w:rPr>
             <w:rStyle w:val="Hyperlink"/>
@@ -1070,7 +1227,7 @@
         <w:pStyle w:val="Compact"/>
         <w:numPr>
           <w:ilvl w:val="0"/>
-          <w:numId w:val="1005"/>
+          <w:numId w:val="1007"/>
         </w:numPr>
       </w:pPr>
       <w:r>
@@ -1079,7 +1236,7 @@
       <w:r>
         <w:t xml:space="preserve"> </w:t>
       </w:r>
-      <w:hyperlink r:id="rId24">
+      <w:hyperlink r:id="rId27">
         <w:r>
           <w:rPr>
             <w:rStyle w:val="Hyperlink"/>
@@ -1093,7 +1250,7 @@
         <w:pStyle w:val="Compact"/>
         <w:numPr>
           <w:ilvl w:val="0"/>
-          <w:numId w:val="1005"/>
+          <w:numId w:val="1007"/>
         </w:numPr>
       </w:pPr>
       <w:r>
@@ -1102,7 +1259,7 @@
       <w:r>
         <w:t xml:space="preserve"> </w:t>
       </w:r>
-      <w:hyperlink r:id="rId25">
+      <w:hyperlink r:id="rId28">
         <w:r>
           <w:rPr>
             <w:rStyle w:val="Hyperlink"/>
@@ -1116,7 +1273,7 @@
         <w:pStyle w:val="Compact"/>
         <w:numPr>
           <w:ilvl w:val="0"/>
-          <w:numId w:val="1005"/>
+          <w:numId w:val="1007"/>
         </w:numPr>
       </w:pPr>
       <w:r>
@@ -1125,7 +1282,7 @@
       <w:r>
         <w:t xml:space="preserve"> </w:t>
       </w:r>
-      <w:hyperlink r:id="rId26">
+      <w:hyperlink r:id="rId29">
         <w:r>
           <w:rPr>
             <w:rStyle w:val="Hyperlink"/>
@@ -1139,7 +1296,7 @@
         <w:pStyle w:val="Compact"/>
         <w:numPr>
           <w:ilvl w:val="0"/>
-          <w:numId w:val="1005"/>
+          <w:numId w:val="1007"/>
         </w:numPr>
       </w:pPr>
       <w:r>
@@ -1148,7 +1305,7 @@
       <w:r>
         <w:t xml:space="preserve"> </w:t>
       </w:r>
-      <w:hyperlink r:id="rId27">
+      <w:hyperlink r:id="rId30">
         <w:r>
           <w:rPr>
             <w:rStyle w:val="Hyperlink"/>
@@ -1157,7 +1314,7 @@
         </w:r>
       </w:hyperlink>
     </w:p>
-    <w:bookmarkEnd w:id="28"/>
+    <w:bookmarkEnd w:id="31"/>
     <w:sectPr>
       <w:footnotePr>
         <w:numRestart w:val="eachSect"/>
@@ -1526,6 +1683,12 @@
     <w:abstractNumId w:val="991"/>
   </w:num>
   <w:num w:numId="1005">
+    <w:abstractNumId w:val="991"/>
+  </w:num>
+  <w:num w:numId="1006">
+    <w:abstractNumId w:val="991"/>
+  </w:num>
+  <w:num w:numId="1007">
     <w:abstractNumId w:val="991"/>
   </w:num>
 </w:numbering>

</xml_diff>

<commit_message>
docs: normalize L2 section numbering
</commit_message>
<xml_diff>
--- a/docs/proposals/utc-health-category/health-coverage-maintenance-l2-final.docx
+++ b/docs/proposals/utc-health-category/health-coverage-maintenance-l2-final.docx
@@ -78,7 +78,7 @@
     <w:bookmarkStart w:id="9" w:name="executive-summary"/>
     <w:p>
       <w:pPr>
-        <w:pStyle w:val="Heading2"/>
+        <w:pStyle w:val="Heading1"/>
       </w:pPr>
       <w:r>
         <w:t xml:space="preserve">Executive summary</w:t>
@@ -112,7 +112,7 @@
     <w:bookmarkStart w:id="10" w:name="why-now"/>
     <w:p>
       <w:pPr>
-        <w:pStyle w:val="Heading2"/>
+        <w:pStyle w:val="Heading1"/>
       </w:pPr>
       <w:r>
         <w:t xml:space="preserve">Why now</w:t>
@@ -130,7 +130,7 @@
     <w:bookmarkStart w:id="11" w:name="concrete-utc-action-requested"/>
     <w:p>
       <w:pPr>
-        <w:pStyle w:val="Heading2"/>
+        <w:pStyle w:val="Heading1"/>
       </w:pPr>
       <w:r>
         <w:t xml:space="preserve">Concrete UTC action requested</w:t>
@@ -266,7 +266,7 @@
     <w:bookmarkStart w:id="12" w:name="review-structure"/>
     <w:p>
       <w:pPr>
-        <w:pStyle w:val="Heading2"/>
+        <w:pStyle w:val="Heading1"/>
       </w:pPr>
       <w:r>
         <w:t xml:space="preserve">Review structure</w:t>
@@ -312,7 +312,7 @@
     <w:bookmarkStart w:id="13" w:name="scope-of-the-maintenance-review"/>
     <w:p>
       <w:pPr>
-        <w:pStyle w:val="Heading2"/>
+        <w:pStyle w:val="Heading1"/>
       </w:pPr>
       <w:r>
         <w:t xml:space="preserve">Scope of the maintenance review</w:t>
@@ -446,7 +446,7 @@
     <w:bookmarkStart w:id="14" w:name="prioritization-framework"/>
     <w:p>
       <w:pPr>
-        <w:pStyle w:val="Heading2"/>
+        <w:pStyle w:val="Heading1"/>
       </w:pPr>
       <w:r>
         <w:t xml:space="preserve">Prioritization framework</w:t>
@@ -692,7 +692,7 @@
     <w:bookmarkStart w:id="15" w:name="relationship-to-individual-submissions"/>
     <w:p>
       <w:pPr>
-        <w:pStyle w:val="Heading2"/>
+        <w:pStyle w:val="Heading1"/>
       </w:pPr>
       <w:r>
         <w:t xml:space="preserve">Relationship to individual submissions</w:t>
@@ -726,7 +726,7 @@
     <w:bookmarkStart w:id="16" w:name="vendor-participation-model"/>
     <w:p>
       <w:pPr>
-        <w:pStyle w:val="Heading2"/>
+        <w:pStyle w:val="Heading1"/>
       </w:pPr>
       <w:r>
         <w:t xml:space="preserve">Vendor participation model</w:t>
@@ -812,7 +812,7 @@
     <w:bookmarkStart w:id="17" w:name="X94c7374cb5b3db78b6a3f52097435d9f82291e7"/>
     <w:p>
       <w:pPr>
-        <w:pStyle w:val="Heading2"/>
+        <w:pStyle w:val="Heading1"/>
       </w:pPr>
       <w:r>
         <w:t xml:space="preserve">Requested referral and working-group action</w:t>
@@ -838,7 +838,7 @@
     <w:bookmarkStart w:id="18" w:name="boundaries-and-safeguards"/>
     <w:p>
       <w:pPr>
-        <w:pStyle w:val="Heading2"/>
+        <w:pStyle w:val="Heading1"/>
       </w:pPr>
       <w:r>
         <w:t xml:space="preserve">Boundaries and safeguards</w:t>
@@ -932,7 +932,7 @@
     <w:bookmarkStart w:id="19" w:name="Xeceb17ef62f4b1dd11b32a7f3fe9de5610f88e4"/>
     <w:p>
       <w:pPr>
-        <w:pStyle w:val="Heading2"/>
+        <w:pStyle w:val="Heading1"/>
       </w:pPr>
       <w:r>
         <w:t xml:space="preserve">Appendix A: Illustrative concepts for the separate proposal track</w:t>
@@ -998,7 +998,7 @@
     <w:bookmarkStart w:id="23" w:name="Xb5a2246859aea1ac8d5db97db9551b28c9dfb59"/>
     <w:p>
       <w:pPr>
-        <w:pStyle w:val="Heading2"/>
+        <w:pStyle w:val="Heading1"/>
       </w:pPr>
       <w:r>
         <w:t xml:space="preserve">Appendix B: Factual basis for the coverage review</w:t>
@@ -1101,7 +1101,7 @@
     <w:bookmarkStart w:id="31" w:name="references"/>
     <w:p>
       <w:pPr>
-        <w:pStyle w:val="Heading2"/>
+        <w:pStyle w:val="Heading1"/>
       </w:pPr>
       <w:r>
         <w:t xml:space="preserve">References</w:t>

</xml_diff>